<commit_message>
amend phrasing of findings
</commit_message>
<xml_diff>
--- a/Data-summary-and-profiling-analysis/Racial profiling in the west - New data exposes unequal policing in Melbourne_model reference.docx
+++ b/Data-summary-and-profiling-analysis/Racial profiling in the west - New data exposes unequal policing in Melbourne_model reference.docx
@@ -11,23 +11,29 @@
           <w:bCs/>
         </w:rPr>
       </w:pPr>
-    </w:p>
-    <w:p>
-      <w:pPr>
-        <w:spacing w:line="360" w:lineRule="auto"/>
+      <w:r>
         <w:rPr>
           <w:rFonts w:ascii="Arial" w:hAnsi="Arial" w:cs="Arial"/>
           <w:b/>
           <w:bCs/>
         </w:rPr>
-      </w:pPr>
+        <w:t xml:space="preserve">Racial profiling in the west: New data </w:t>
+      </w:r>
       <w:r>
         <w:rPr>
           <w:rFonts w:ascii="Arial" w:hAnsi="Arial" w:cs="Arial"/>
           <w:b/>
           <w:bCs/>
         </w:rPr>
-        <w:t>New data reveals racial disparities in Victoria Police searches across Melbourne’s west</w:t>
+        <w:t>indicates</w:t>
+      </w:r>
+      <w:r>
+        <w:rPr>
+          <w:rFonts w:ascii="Arial" w:hAnsi="Arial" w:cs="Arial"/>
+          <w:b/>
+          <w:bCs/>
+        </w:rPr>
+        <w:t xml:space="preserve"> unequal policing in Melbourne</w:t>
       </w:r>
     </w:p>
     <w:p>
@@ -83,26 +89,124 @@
         <w:t>new analysis of stop-and-search data</w:t>
       </w:r>
       <w:r>
+        <w:t xml:space="preserve"> </w:t>
+      </w:r>
+      <w:r>
+        <w:rPr>
+          <w:rFonts w:ascii="Arial" w:hAnsi="Arial" w:cs="Arial"/>
+        </w:rPr>
+        <w:t>shows that</w:t>
+      </w:r>
+      <w:r>
+        <w:rPr>
+          <w:rFonts w:ascii="Arial" w:hAnsi="Arial" w:cs="Arial"/>
+        </w:rPr>
+        <w:t xml:space="preserve"> unequal search practices </w:t>
+      </w:r>
+      <w:r>
+        <w:rPr>
+          <w:rFonts w:ascii="Arial" w:hAnsi="Arial" w:cs="Arial"/>
+        </w:rPr>
+        <w:t>towards African Australians persist across Melbourne</w:t>
+      </w:r>
+      <w:r>
+        <w:rPr>
+          <w:rFonts w:ascii="Arial" w:hAnsi="Arial" w:cs="Arial"/>
+        </w:rPr>
+        <w:t xml:space="preserve">. </w:t>
+      </w:r>
+      <w:r>
+        <w:rPr>
+          <w:rFonts w:ascii="Arial" w:hAnsi="Arial" w:cs="Arial"/>
+        </w:rPr>
+        <w:t>An examination of</w:t>
+      </w:r>
+      <w:r>
+        <w:rPr>
+          <w:rFonts w:ascii="Arial" w:hAnsi="Arial" w:cs="Arial"/>
+        </w:rPr>
+        <w:t xml:space="preserve"> </w:t>
+      </w:r>
+      <w:r>
+        <w:rPr>
+          <w:rFonts w:ascii="Arial" w:hAnsi="Arial" w:cs="Arial"/>
+        </w:rPr>
+        <w:t xml:space="preserve">more than 7,500 drug searches by uniformed officers showed evidence </w:t>
+      </w:r>
+      <w:r>
+        <w:rPr>
+          <w:rFonts w:ascii="Arial" w:hAnsi="Arial" w:cs="Arial"/>
+        </w:rPr>
+        <w:t>consistent with</w:t>
+      </w:r>
+      <w:r>
+        <w:rPr>
+          <w:rFonts w:ascii="Arial" w:hAnsi="Arial" w:cs="Arial"/>
+        </w:rPr>
+        <w:t xml:space="preserve"> bias in</w:t>
+      </w:r>
+      <w:r>
+        <w:rPr>
+          <w:rFonts w:ascii="Arial" w:hAnsi="Arial" w:cs="Arial"/>
+        </w:rPr>
+        <w:t xml:space="preserve"> </w:t>
+      </w:r>
+      <w:r>
+        <w:rPr>
+          <w:rFonts w:ascii="Arial" w:hAnsi="Arial" w:cs="Arial"/>
+        </w:rPr>
+        <w:t>search decisions</w:t>
+      </w:r>
+      <w:r>
+        <w:rPr>
+          <w:rFonts w:ascii="Arial" w:hAnsi="Arial" w:cs="Arial"/>
+        </w:rPr>
+        <w:t xml:space="preserve">, </w:t>
+      </w:r>
+      <w:r>
+        <w:rPr>
+          <w:rFonts w:ascii="Arial" w:hAnsi="Arial" w:cs="Arial"/>
+        </w:rPr>
+        <w:t xml:space="preserve">with </w:t>
+      </w:r>
+      <w:r>
+        <w:rPr>
+          <w:rFonts w:ascii="Arial" w:hAnsi="Arial" w:cs="Arial"/>
+        </w:rPr>
+        <w:t xml:space="preserve">disparities </w:t>
+      </w:r>
+      <w:r>
+        <w:rPr>
+          <w:rFonts w:ascii="Arial" w:hAnsi="Arial" w:cs="Arial"/>
+        </w:rPr>
+        <w:t xml:space="preserve">most pronounced </w:t>
+      </w:r>
+      <w:r>
+        <w:rPr>
+          <w:rFonts w:ascii="Arial" w:hAnsi="Arial" w:cs="Arial"/>
+        </w:rPr>
+        <w:t>in Melbourne’s north-western suburbs</w:t>
+      </w:r>
+      <w:r>
         <w:rPr>
           <w:rFonts w:ascii="Arial" w:hAnsi="Arial" w:cs="Arial"/>
         </w:rPr>
         <w:t>,</w:t>
       </w:r>
       <w:r>
-        <w:t xml:space="preserve"> </w:t>
-      </w:r>
-      <w:r>
-        <w:rPr>
-          <w:rFonts w:ascii="Arial" w:hAnsi="Arial" w:cs="Arial"/>
-        </w:rPr>
-        <w:t>points to officers applying a lower standard of suspicion when searching people of African appearance</w:t>
-      </w:r>
-      <w:r>
-        <w:rPr>
-          <w:rFonts w:ascii="Arial" w:hAnsi="Arial" w:cs="Arial"/>
-        </w:rPr>
-        <w:t>—a recognised hallmark of racial profiling. The study examined more than 7,500 drug searches of pedestrians by uniformed officers, finding the most pronounced disparities in Melbourne’s north-western suburbs</w:t>
-      </w:r>
+        <w:rPr>
+          <w:rFonts w:ascii="Arial" w:hAnsi="Arial" w:cs="Arial"/>
+        </w:rPr>
+        <w:t xml:space="preserve"> particularly </w:t>
+      </w:r>
+      <w:proofErr w:type="spellStart"/>
+      <w:r>
+        <w:rPr>
+          <w:rFonts w:ascii="Arial" w:hAnsi="Arial" w:cs="Arial"/>
+        </w:rPr>
+        <w:t>Brimbank</w:t>
+      </w:r>
+      <w:proofErr w:type="spellEnd"/>
       <w:r>
         <w:rPr>
           <w:rFonts w:ascii="Arial" w:hAnsi="Arial" w:cs="Arial"/>
@@ -113,57 +217,7 @@
         <w:rPr>
           <w:rFonts w:ascii="Arial" w:hAnsi="Arial" w:cs="Arial"/>
         </w:rPr>
-        <w:t xml:space="preserve"> particularly </w:t>
-      </w:r>
-      <w:proofErr w:type="spellStart"/>
-      <w:r>
-        <w:rPr>
-          <w:rFonts w:ascii="Arial" w:hAnsi="Arial" w:cs="Arial"/>
-        </w:rPr>
-        <w:t>Brimbank</w:t>
-      </w:r>
-      <w:proofErr w:type="spellEnd"/>
-      <w:r>
-        <w:rPr>
-          <w:rFonts w:ascii="Arial" w:hAnsi="Arial" w:cs="Arial"/>
-        </w:rPr>
-        <w:t>,</w:t>
-      </w:r>
-      <w:r>
-        <w:rPr>
-          <w:rFonts w:ascii="Arial" w:hAnsi="Arial" w:cs="Arial"/>
-        </w:rPr>
-        <w:t xml:space="preserve"> Melton, and Werribee</w:t>
-      </w:r>
-      <w:r>
-        <w:rPr>
-          <w:rFonts w:ascii="Arial" w:hAnsi="Arial" w:cs="Arial"/>
-        </w:rPr>
-        <w:t xml:space="preserve">, </w:t>
-      </w:r>
-      <w:r>
-        <w:rPr>
-          <w:rFonts w:ascii="Arial" w:hAnsi="Arial" w:cs="Arial"/>
-        </w:rPr>
-        <w:t>where migrant</w:t>
-      </w:r>
-      <w:r>
-        <w:rPr>
-          <w:rFonts w:ascii="Arial" w:hAnsi="Arial" w:cs="Arial"/>
-        </w:rPr>
-        <w:t xml:space="preserve"> and refugee</w:t>
-      </w:r>
-      <w:r>
-        <w:rPr>
-          <w:rFonts w:ascii="Arial" w:hAnsi="Arial" w:cs="Arial"/>
-        </w:rPr>
-        <w:t xml:space="preserve"> communities are concentrated</w:t>
-      </w:r>
-      <w:r>
-        <w:rPr>
-          <w:rFonts w:ascii="Arial" w:hAnsi="Arial" w:cs="Arial"/>
-        </w:rPr>
-        <w:t>.</w:t>
+        <w:t xml:space="preserve"> Melton, and Werribee.</w:t>
       </w:r>
     </w:p>
     <w:p>
@@ -304,7 +358,19 @@
         <w:rPr>
           <w:rFonts w:ascii="Arial" w:hAnsi="Arial" w:cs="Arial"/>
         </w:rPr>
-        <w:t>The new analysis draws on these data, focusing on comparable pedestrian searches conducted in public places by uniformed police.</w:t>
+        <w:t xml:space="preserve">The new analysis draws on these data, focusing on comparable pedestrian searches conducted in public places by uniformed </w:t>
+      </w:r>
+      <w:r>
+        <w:rPr>
+          <w:rFonts w:ascii="Arial" w:hAnsi="Arial" w:cs="Arial"/>
+        </w:rPr>
+        <w:t xml:space="preserve">‘general duties’ </w:t>
+      </w:r>
+      <w:r>
+        <w:rPr>
+          <w:rFonts w:ascii="Arial" w:hAnsi="Arial" w:cs="Arial"/>
+        </w:rPr>
+        <w:t>police.</w:t>
       </w:r>
     </w:p>
     <w:p>
@@ -414,20 +480,26 @@
         <w:rPr>
           <w:rFonts w:ascii="Arial" w:hAnsi="Arial" w:cs="Arial"/>
         </w:rPr>
+        <w:t xml:space="preserve">For example, if police stop and search 100 African-appearing people and 100 white-appearing people, and both groups were truly selected based on </w:t>
+      </w:r>
+      <w:r>
+        <w:rPr>
+          <w:rFonts w:ascii="Arial" w:hAnsi="Arial" w:cs="Arial"/>
+        </w:rPr>
+        <w:t>a “</w:t>
+      </w:r>
+      <w:r>
+        <w:rPr>
+          <w:rFonts w:ascii="Arial" w:hAnsi="Arial" w:cs="Arial"/>
+        </w:rPr>
+        <w:t xml:space="preserve">reasonable </w:t>
+      </w:r>
+      <w:r>
+        <w:rPr>
+          <w:rFonts w:ascii="Arial" w:hAnsi="Arial" w:cs="Arial"/>
+        </w:rPr>
         <w:lastRenderedPageBreak/>
-        <w:t xml:space="preserve">For example, if police stop and search 100 African-appearing people and 100 white-appearing people, and both groups were truly selected based on </w:t>
-      </w:r>
-      <w:r>
-        <w:rPr>
-          <w:rFonts w:ascii="Arial" w:hAnsi="Arial" w:cs="Arial"/>
-        </w:rPr>
-        <w:t>a “</w:t>
-      </w:r>
-      <w:r>
-        <w:rPr>
-          <w:rFonts w:ascii="Arial" w:hAnsi="Arial" w:cs="Arial"/>
-        </w:rPr>
-        <w:t>reasonable suspicion,</w:t>
+        <w:t>suspicion,</w:t>
       </w:r>
       <w:r>
         <w:rPr>
@@ -513,19 +585,7 @@
         <w:rPr>
           <w:rFonts w:ascii="Arial" w:hAnsi="Arial" w:cs="Arial"/>
         </w:rPr>
-        <w:t xml:space="preserve">his is </w:t>
-      </w:r>
-      <w:r>
-        <w:rPr>
-          <w:rFonts w:ascii="Arial" w:hAnsi="Arial" w:cs="Arial"/>
-        </w:rPr>
-        <w:t xml:space="preserve">consistent with </w:t>
-      </w:r>
-      <w:r>
-        <w:rPr>
-          <w:rFonts w:ascii="Arial" w:hAnsi="Arial" w:cs="Arial"/>
-        </w:rPr>
-        <w:t>racial profiling.</w:t>
+        <w:t>his is racial profiling.</w:t>
       </w:r>
     </w:p>
     <w:p>
@@ -551,19 +611,7 @@
         <w:rPr>
           <w:rFonts w:ascii="Arial" w:hAnsi="Arial" w:cs="Arial"/>
         </w:rPr>
-        <w:t xml:space="preserve"> used statistical modelling that compared searches within the same police station and year. That means any differences found are more likely to reflect how </w:t>
-      </w:r>
-      <w:r>
-        <w:rPr>
-          <w:rFonts w:ascii="Arial" w:hAnsi="Arial" w:cs="Arial"/>
-        </w:rPr>
-        <w:t xml:space="preserve">police </w:t>
-      </w:r>
-      <w:r>
-        <w:rPr>
-          <w:rFonts w:ascii="Arial" w:hAnsi="Arial" w:cs="Arial"/>
-        </w:rPr>
-        <w:t>officers use discretion, not who lives in the area.</w:t>
+        <w:t xml:space="preserve"> used statistical modelling that compared searches within the same police station and year. </w:t>
       </w:r>
     </w:p>
     <w:p>
@@ -581,7 +629,23 @@
           <w:b/>
           <w:bCs/>
         </w:rPr>
-        <w:t>Bias evident across Melbourne divisions and stations</w:t>
+        <w:t xml:space="preserve">Bias </w:t>
+      </w:r>
+      <w:r>
+        <w:rPr>
+          <w:rFonts w:ascii="Arial" w:hAnsi="Arial" w:cs="Arial"/>
+          <w:b/>
+          <w:bCs/>
+        </w:rPr>
+        <w:t>indicated</w:t>
+      </w:r>
+      <w:r>
+        <w:rPr>
+          <w:rFonts w:ascii="Arial" w:hAnsi="Arial" w:cs="Arial"/>
+          <w:b/>
+          <w:bCs/>
+        </w:rPr>
+        <w:t xml:space="preserve"> across Melbourne divisions and stations</w:t>
       </w:r>
     </w:p>
     <w:p>
@@ -607,7 +671,7 @@
         <w:rPr>
           <w:rFonts w:ascii="Arial" w:hAnsi="Arial" w:cs="Arial"/>
         </w:rPr>
-        <w:t>hite appearance, even after accounting for station differences, officer rank, gender and local crime rates</w:t>
+        <w:t>hite appearance, even after accounting for station differences</w:t>
       </w:r>
       <w:r>
         <w:rPr>
@@ -633,7 +697,7 @@
         <w:rPr>
           <w:rFonts w:ascii="Arial" w:hAnsi="Arial" w:cs="Arial"/>
         </w:rPr>
-        <w:t>The pattern was not uniform but was strongest in Melbourne’s north-west corridor, where many of the city’s migrant and refugee communities live. In</w:t>
+        <w:t>The pattern was strongest in Melbourne’s north-west corridor, where many of the city’s migrant and refugee communities live. In</w:t>
       </w:r>
       <w:r>
         <w:rPr>
@@ -740,8 +804,25 @@
         <w:rPr>
           <w:rFonts w:ascii="Arial" w:hAnsi="Arial" w:cs="Arial"/>
         </w:rPr>
-        <w:lastRenderedPageBreak/>
-        <w:t xml:space="preserve">These disparities point not just to individual decision-making but to problematic cultures within certain police units. Research has long shown that discriminatory practices can become entrenched within teams, shaped by </w:t>
+        <w:t>These disparities point to problematic cultures within</w:t>
+      </w:r>
+      <w:r>
+        <w:rPr>
+          <w:rFonts w:ascii="Arial" w:hAnsi="Arial" w:cs="Arial"/>
+        </w:rPr>
+        <w:t xml:space="preserve"> stations</w:t>
+      </w:r>
+      <w:r>
+        <w:rPr>
+          <w:rFonts w:ascii="Arial" w:hAnsi="Arial" w:cs="Arial"/>
+        </w:rPr>
+        <w:t xml:space="preserve">. </w:t>
+      </w:r>
+      <w:r>
+        <w:rPr>
+          <w:rFonts w:ascii="Arial" w:hAnsi="Arial" w:cs="Arial"/>
+        </w:rPr>
+        <w:t xml:space="preserve">Research has long shown that discriminatory practices can become entrenched within teams, shaped by </w:t>
       </w:r>
       <w:hyperlink r:id="rId12" w:history="1">
         <w:r>
@@ -749,7 +830,7 @@
             <w:rStyle w:val="Hyperlink"/>
             <w:rFonts w:ascii="Arial" w:hAnsi="Arial" w:cs="Arial"/>
           </w:rPr>
-          <w:t>leadership, peer norms and a lack of oversight</w:t>
+          <w:t>leadership, peer norms and a lack of accountability</w:t>
         </w:r>
       </w:hyperlink>
       <w:r>
@@ -770,6 +851,7 @@
         <w:rPr>
           <w:rFonts w:ascii="Arial" w:hAnsi="Arial" w:cs="Arial"/>
         </w:rPr>
+        <w:lastRenderedPageBreak/>
         <w:t>These findings raise serious questions about how policing is being carried out in Melbourne’s west, particularly in lower-income, multicultural communities. For families already navigating the challenges of economic stress</w:t>
       </w:r>
       <w:r>
@@ -830,13 +912,13 @@
         <w:rPr>
           <w:rFonts w:ascii="Arial" w:hAnsi="Arial" w:cs="Arial"/>
         </w:rPr>
-        <w:t>Racial profiling in Melbourne can be clearly identified</w:t>
-      </w:r>
-      <w:r>
-        <w:rPr>
-          <w:rFonts w:ascii="Arial" w:hAnsi="Arial" w:cs="Arial"/>
-        </w:rPr>
-        <w:t xml:space="preserve"> and addressed </w:t>
+        <w:t xml:space="preserve">The challenge of racial profiling can be identified and </w:t>
+      </w:r>
+      <w:r>
+        <w:rPr>
+          <w:rFonts w:ascii="Arial" w:hAnsi="Arial" w:cs="Arial"/>
+        </w:rPr>
+        <w:t xml:space="preserve">addressed </w:t>
       </w:r>
       <w:r>
         <w:rPr>
@@ -1217,7 +1299,6 @@
         <w:rPr>
           <w:rFonts w:ascii="Arial" w:hAnsi="Arial" w:cs="Arial"/>
         </w:rPr>
-        <w:lastRenderedPageBreak/>
         <w:t xml:space="preserve">Concerns about racial profiling </w:t>
       </w:r>
       <w:r>
@@ -1315,6 +1396,7 @@
         <w:rPr>
           <w:rFonts w:ascii="Arial" w:hAnsi="Arial" w:cs="Arial"/>
         </w:rPr>
+        <w:lastRenderedPageBreak/>
         <w:t xml:space="preserve">These developments underline the urgency of Victoria Police </w:t>
       </w:r>
       <w:r>

</xml_diff>